<commit_message>
fixed hw task 7
</commit_message>
<xml_diff>
--- a/Task7/PG_DWH_Aliaksei_Papou_HW_Task7.docx
+++ b/Task7/PG_DWH_Aliaksei_Papou_HW_Task7.docx
@@ -50,21 +50,7 @@
           <w:bCs w:val="false"/>
         </w:rPr>
         <w:tab/>
-        <w:t xml:space="preserve">Repeatability is implemented through a WHERE NOT EXISTS check on business keys (SRC_ID + SOURCE_SYSTEM) within the procedure. </w:t>
-      </w:r>
-      <w:r>
-        <w:rPr>
-          <w:b w:val="false"/>
-          <w:bCs w:val="false"/>
-        </w:rPr>
-        <w:t>F</w:t>
-      </w:r>
-      <w:r>
-        <w:rPr>
-          <w:b w:val="false"/>
-          <w:bCs w:val="false"/>
-        </w:rPr>
-        <w:t>unctions and procedures are created via CREATE OR REPLACE. I also added an Exception block to each procedure. Any error is logged to MTA_LOGGING with the 'ERROR' status.</w:t>
+        <w:t>Repeatability is implemented through a WHERE NOT EXISTS check on business keys (SRC_ID + SOURCE_SYSTEM) within the procedure. Functions and procedures are created via CREATE OR REPLACE. I also added an Exception block to each procedure. Any error is logged to MTA_LOGGING with the 'ERROR' status.</w:t>
       </w:r>
     </w:p>
     <w:p>
@@ -174,12 +160,13 @@
           <w:p>
             <w:pPr>
               <w:pStyle w:val="TableContents"/>
+              <w:widowControl w:val="false"/>
               <w:rPr/>
             </w:pPr>
             <w:r>
               <w:rPr/>
               <w:drawing>
-                <wp:anchor behindDoc="0" distT="0" distB="0" distL="0" distR="0" simplePos="0" locked="0" layoutInCell="0" allowOverlap="1" relativeHeight="2">
+                <wp:anchor behindDoc="0" distT="0" distB="0" distL="0" distR="0" simplePos="0" locked="0" layoutInCell="1" allowOverlap="1" relativeHeight="2">
                   <wp:simplePos x="0" y="0"/>
                   <wp:positionH relativeFrom="column">
                     <wp:align>center</wp:align>
@@ -277,6 +264,7 @@
           <w:p>
             <w:pPr>
               <w:pStyle w:val="TableContents"/>
+              <w:widowControl w:val="false"/>
               <w:rPr>
                 <w:b w:val="false"/>
                 <w:b w:val="false"/>
@@ -289,7 +277,7 @@
                 <w:bCs w:val="false"/>
               </w:rPr>
               <w:drawing>
-                <wp:anchor behindDoc="0" distT="0" distB="0" distL="0" distR="0" simplePos="0" locked="0" layoutInCell="0" allowOverlap="1" relativeHeight="3">
+                <wp:anchor behindDoc="0" distT="0" distB="0" distL="0" distR="0" simplePos="0" locked="0" layoutInCell="1" allowOverlap="1" relativeHeight="3">
                   <wp:simplePos x="0" y="0"/>
                   <wp:positionH relativeFrom="column">
                     <wp:align>center</wp:align>
@@ -425,12 +413,13 @@
           <w:p>
             <w:pPr>
               <w:pStyle w:val="TableContents"/>
+              <w:widowControl w:val="false"/>
               <w:rPr/>
             </w:pPr>
             <w:r>
               <w:rPr/>
               <w:drawing>
-                <wp:anchor behindDoc="0" distT="0" distB="0" distL="0" distR="0" simplePos="0" locked="0" layoutInCell="0" allowOverlap="1" relativeHeight="4">
+                <wp:anchor behindDoc="0" distT="0" distB="0" distL="0" distR="0" simplePos="0" locked="0" layoutInCell="1" allowOverlap="1" relativeHeight="4">
                   <wp:simplePos x="0" y="0"/>
                   <wp:positionH relativeFrom="column">
                     <wp:align>center</wp:align>
@@ -632,11 +621,7 @@
       </w:pPr>
       <w:r>
         <w:rPr/>
-        <w:t xml:space="preserve">For example, the data loaded into the table </w:t>
-      </w:r>
-      <w:r>
-        <w:rPr/>
-        <w:t>BL_3NF.CE_STORES</w:t>
+        <w:t>For example, the data loaded into the table BL_3NF.CE_STORES</w:t>
       </w:r>
     </w:p>
     <w:tbl>
@@ -670,6 +655,7 @@
           <w:p>
             <w:pPr>
               <w:pStyle w:val="TableContents"/>
+              <w:widowControl w:val="false"/>
               <w:rPr>
                 <w:b w:val="false"/>
                 <w:b w:val="false"/>
@@ -682,7 +668,7 @@
                 <w:bCs w:val="false"/>
               </w:rPr>
               <w:drawing>
-                <wp:anchor behindDoc="0" distT="0" distB="0" distL="0" distR="0" simplePos="0" locked="0" layoutInCell="0" allowOverlap="1" relativeHeight="5">
+                <wp:anchor behindDoc="0" distT="0" distB="0" distL="0" distR="0" simplePos="0" locked="0" layoutInCell="1" allowOverlap="1" relativeHeight="5">
                   <wp:simplePos x="0" y="0"/>
                   <wp:positionH relativeFrom="column">
                     <wp:align>center</wp:align>
@@ -785,6 +771,7 @@
           <w:p>
             <w:pPr>
               <w:pStyle w:val="TableContents"/>
+              <w:widowControl w:val="false"/>
               <w:rPr>
                 <w:b w:val="false"/>
                 <w:b w:val="false"/>
@@ -797,7 +784,7 @@
                 <w:bCs w:val="false"/>
               </w:rPr>
               <w:drawing>
-                <wp:anchor behindDoc="0" distT="0" distB="0" distL="0" distR="0" simplePos="0" locked="0" layoutInCell="0" allowOverlap="1" relativeHeight="6">
+                <wp:anchor behindDoc="0" distT="0" distB="0" distL="0" distR="0" simplePos="0" locked="0" layoutInCell="1" allowOverlap="1" relativeHeight="6">
                   <wp:simplePos x="0" y="0"/>
                   <wp:positionH relativeFrom="column">
                     <wp:align>center</wp:align>
@@ -846,6 +833,429 @@
         </w:tc>
       </w:tr>
     </w:tbl>
+    <w:p>
+      <w:pPr>
+        <w:pStyle w:val="Normal"/>
+        <w:bidi w:val="0"/>
+        <w:jc w:val="left"/>
+        <w:rPr/>
+      </w:pPr>
+      <w:r>
+        <w:rPr/>
+      </w:r>
+    </w:p>
+    <w:p>
+      <w:pPr>
+        <w:pStyle w:val="Normal"/>
+        <w:bidi w:val="0"/>
+        <w:jc w:val="left"/>
+        <w:rPr/>
+      </w:pPr>
+      <w:r>
+        <w:rPr/>
+        <w:t xml:space="preserve">The SCD2 logic was successfully tested: when the product </w:t>
+      </w:r>
+      <w:r>
+        <w:rPr/>
+        <w:t>warranty period</w:t>
+      </w:r>
+      <w:r>
+        <w:rPr/>
+        <w:t xml:space="preserve"> (</w:t>
+      </w:r>
+      <w:r>
+        <w:rPr/>
+        <w:t>iMac Pro</w:t>
+      </w:r>
+      <w:r>
+        <w:rPr/>
+        <w:t xml:space="preserve"> </w:t>
+      </w:r>
+      <w:r>
+        <w:rPr/>
+        <w:t>warranty period</w:t>
+      </w:r>
+      <w:r>
+        <w:rPr/>
+        <w:t xml:space="preserve"> was changed from </w:t>
+      </w:r>
+      <w:r>
+        <w:rPr/>
+        <w:t>12</w:t>
+      </w:r>
+      <w:r>
+        <w:rPr/>
+        <w:t xml:space="preserve"> to </w:t>
+      </w:r>
+      <w:r>
+        <w:rPr/>
+        <w:t>24</w:t>
+      </w:r>
+      <w:r>
+        <w:rPr/>
+        <w:t xml:space="preserve">) was changed in the CSV file, the procedure correctly identified the changes. The old version of the record was deactivated (closed with the end date), and a new version was created with the current data. The data was changed correctly on both storage layers. </w:t>
+      </w:r>
+    </w:p>
+    <w:p>
+      <w:pPr>
+        <w:pStyle w:val="Normal"/>
+        <w:bidi w:val="0"/>
+        <w:jc w:val="left"/>
+        <w:rPr/>
+      </w:pPr>
+      <w:r>
+        <w:rPr/>
+      </w:r>
+    </w:p>
+    <w:p>
+      <w:pPr>
+        <w:pStyle w:val="Normal"/>
+        <w:bidi w:val="0"/>
+        <w:jc w:val="left"/>
+        <w:rPr/>
+      </w:pPr>
+      <w:r>
+        <w:rPr/>
+      </w:r>
+    </w:p>
+    <w:tbl>
+      <w:tblPr>
+        <w:tblW w:w="5000" w:type="pct"/>
+        <w:jc w:val="left"/>
+        <w:tblInd w:w="-5" w:type="dxa"/>
+        <w:tblLayout w:type="fixed"/>
+        <w:tblCellMar>
+          <w:top w:w="55" w:type="dxa"/>
+          <w:left w:w="55" w:type="dxa"/>
+          <w:bottom w:w="55" w:type="dxa"/>
+          <w:right w:w="55" w:type="dxa"/>
+        </w:tblCellMar>
+      </w:tblPr>
+      <w:tblGrid>
+        <w:gridCol w:w="9638"/>
+      </w:tblGrid>
+      <w:tr>
+        <w:trPr/>
+        <w:tc>
+          <w:tcPr>
+            <w:tcW w:w="9638" w:type="dxa"/>
+            <w:tcBorders>
+              <w:top w:val="single" w:sz="4" w:space="0" w:color="000000"/>
+              <w:left w:val="single" w:sz="4" w:space="0" w:color="000000"/>
+              <w:bottom w:val="single" w:sz="4" w:space="0" w:color="000000"/>
+              <w:right w:val="single" w:sz="4" w:space="0" w:color="000000"/>
+            </w:tcBorders>
+          </w:tcPr>
+          <w:p>
+            <w:pPr>
+              <w:pStyle w:val="TableContents"/>
+              <w:rPr>
+                <w:b w:val="false"/>
+                <w:b w:val="false"/>
+                <w:bCs w:val="false"/>
+              </w:rPr>
+            </w:pPr>
+            <w:r>
+              <w:rPr>
+                <w:b w:val="false"/>
+                <w:bCs w:val="false"/>
+              </w:rPr>
+              <w:drawing>
+                <wp:anchor behindDoc="0" distT="0" distB="0" distL="0" distR="0" simplePos="0" locked="0" layoutInCell="0" allowOverlap="1" relativeHeight="7">
+                  <wp:simplePos x="0" y="0"/>
+                  <wp:positionH relativeFrom="column">
+                    <wp:align>center</wp:align>
+                  </wp:positionH>
+                  <wp:positionV relativeFrom="paragraph">
+                    <wp:posOffset>635</wp:posOffset>
+                  </wp:positionV>
+                  <wp:extent cx="6050280" cy="3321050"/>
+                  <wp:effectExtent l="0" t="0" r="0" b="0"/>
+                  <wp:wrapSquare wrapText="largest"/>
+                  <wp:docPr id="6" name="Image6" descr=""/>
+                  <wp:cNvGraphicFramePr>
+                    <a:graphicFrameLocks xmlns:a="http://schemas.openxmlformats.org/drawingml/2006/main" noChangeAspect="1"/>
+                  </wp:cNvGraphicFramePr>
+                  <a:graphic xmlns:a="http://schemas.openxmlformats.org/drawingml/2006/main">
+                    <a:graphicData uri="http://schemas.openxmlformats.org/drawingml/2006/picture">
+                      <pic:pic xmlns:pic="http://schemas.openxmlformats.org/drawingml/2006/picture">
+                        <pic:nvPicPr>
+                          <pic:cNvPr id="6" name="Image6" descr=""/>
+                          <pic:cNvPicPr>
+                            <a:picLocks noChangeAspect="1" noChangeArrowheads="1"/>
+                          </pic:cNvPicPr>
+                        </pic:nvPicPr>
+                        <pic:blipFill>
+                          <a:blip r:embed="rId7"/>
+                          <a:stretch>
+                            <a:fillRect/>
+                          </a:stretch>
+                        </pic:blipFill>
+                        <pic:spPr bwMode="auto">
+                          <a:xfrm>
+                            <a:off x="0" y="0"/>
+                            <a:ext cx="6050280" cy="3321050"/>
+                          </a:xfrm>
+                          <a:prstGeom prst="rect">
+                            <a:avLst/>
+                          </a:prstGeom>
+                        </pic:spPr>
+                      </pic:pic>
+                    </a:graphicData>
+                  </a:graphic>
+                </wp:anchor>
+              </w:drawing>
+            </w:r>
+          </w:p>
+        </w:tc>
+      </w:tr>
+    </w:tbl>
+    <w:p>
+      <w:pPr>
+        <w:pStyle w:val="Normal"/>
+        <w:bidi w:val="0"/>
+        <w:jc w:val="left"/>
+        <w:rPr/>
+      </w:pPr>
+      <w:r>
+        <w:rPr/>
+        <w:t>Changed warranty period from 12 to 24 (BL_3NF)</w:t>
+      </w:r>
+    </w:p>
+    <w:p>
+      <w:pPr>
+        <w:pStyle w:val="Normal"/>
+        <w:bidi w:val="0"/>
+        <w:jc w:val="left"/>
+        <w:rPr/>
+      </w:pPr>
+      <w:r>
+        <w:rPr/>
+      </w:r>
+    </w:p>
+    <w:tbl>
+      <w:tblPr>
+        <w:tblW w:w="5000" w:type="pct"/>
+        <w:jc w:val="left"/>
+        <w:tblInd w:w="-5" w:type="dxa"/>
+        <w:tblLayout w:type="fixed"/>
+        <w:tblCellMar>
+          <w:top w:w="55" w:type="dxa"/>
+          <w:left w:w="55" w:type="dxa"/>
+          <w:bottom w:w="55" w:type="dxa"/>
+          <w:right w:w="55" w:type="dxa"/>
+        </w:tblCellMar>
+      </w:tblPr>
+      <w:tblGrid>
+        <w:gridCol w:w="9638"/>
+      </w:tblGrid>
+      <w:tr>
+        <w:trPr/>
+        <w:tc>
+          <w:tcPr>
+            <w:tcW w:w="9638" w:type="dxa"/>
+            <w:tcBorders>
+              <w:top w:val="single" w:sz="4" w:space="0" w:color="000000"/>
+              <w:left w:val="single" w:sz="4" w:space="0" w:color="000000"/>
+              <w:bottom w:val="single" w:sz="4" w:space="0" w:color="000000"/>
+              <w:right w:val="single" w:sz="4" w:space="0" w:color="000000"/>
+            </w:tcBorders>
+          </w:tcPr>
+          <w:p>
+            <w:pPr>
+              <w:pStyle w:val="TableContents"/>
+              <w:rPr/>
+            </w:pPr>
+            <w:r>
+              <w:rPr/>
+              <w:drawing>
+                <wp:anchor behindDoc="0" distT="0" distB="0" distL="0" distR="0" simplePos="0" locked="0" layoutInCell="0" allowOverlap="1" relativeHeight="8">
+                  <wp:simplePos x="0" y="0"/>
+                  <wp:positionH relativeFrom="column">
+                    <wp:align>center</wp:align>
+                  </wp:positionH>
+                  <wp:positionV relativeFrom="paragraph">
+                    <wp:posOffset>635</wp:posOffset>
+                  </wp:positionV>
+                  <wp:extent cx="6050280" cy="3321050"/>
+                  <wp:effectExtent l="0" t="0" r="0" b="0"/>
+                  <wp:wrapSquare wrapText="largest"/>
+                  <wp:docPr id="7" name="Image7" descr=""/>
+                  <wp:cNvGraphicFramePr>
+                    <a:graphicFrameLocks xmlns:a="http://schemas.openxmlformats.org/drawingml/2006/main" noChangeAspect="1"/>
+                  </wp:cNvGraphicFramePr>
+                  <a:graphic xmlns:a="http://schemas.openxmlformats.org/drawingml/2006/main">
+                    <a:graphicData uri="http://schemas.openxmlformats.org/drawingml/2006/picture">
+                      <pic:pic xmlns:pic="http://schemas.openxmlformats.org/drawingml/2006/picture">
+                        <pic:nvPicPr>
+                          <pic:cNvPr id="7" name="Image7" descr=""/>
+                          <pic:cNvPicPr>
+                            <a:picLocks noChangeAspect="1" noChangeArrowheads="1"/>
+                          </pic:cNvPicPr>
+                        </pic:nvPicPr>
+                        <pic:blipFill>
+                          <a:blip r:embed="rId8"/>
+                          <a:stretch>
+                            <a:fillRect/>
+                          </a:stretch>
+                        </pic:blipFill>
+                        <pic:spPr bwMode="auto">
+                          <a:xfrm>
+                            <a:off x="0" y="0"/>
+                            <a:ext cx="6050280" cy="3321050"/>
+                          </a:xfrm>
+                          <a:prstGeom prst="rect">
+                            <a:avLst/>
+                          </a:prstGeom>
+                        </pic:spPr>
+                      </pic:pic>
+                    </a:graphicData>
+                  </a:graphic>
+                </wp:anchor>
+              </w:drawing>
+            </w:r>
+          </w:p>
+        </w:tc>
+      </w:tr>
+    </w:tbl>
+    <w:p>
+      <w:pPr>
+        <w:pStyle w:val="Normal"/>
+        <w:bidi w:val="0"/>
+        <w:jc w:val="left"/>
+        <w:rPr/>
+      </w:pPr>
+      <w:r>
+        <w:rPr/>
+        <w:t>Changed warranty period from 12 to 24 (BL_DM)</w:t>
+      </w:r>
+    </w:p>
+    <w:p>
+      <w:pPr>
+        <w:pStyle w:val="Normal"/>
+        <w:bidi w:val="0"/>
+        <w:jc w:val="left"/>
+        <w:rPr/>
+      </w:pPr>
+      <w:r>
+        <w:rPr/>
+      </w:r>
+    </w:p>
+    <w:tbl>
+      <w:tblPr>
+        <w:tblW w:w="5000" w:type="pct"/>
+        <w:jc w:val="left"/>
+        <w:tblInd w:w="-5" w:type="dxa"/>
+        <w:tblLayout w:type="fixed"/>
+        <w:tblCellMar>
+          <w:top w:w="55" w:type="dxa"/>
+          <w:left w:w="55" w:type="dxa"/>
+          <w:bottom w:w="55" w:type="dxa"/>
+          <w:right w:w="55" w:type="dxa"/>
+        </w:tblCellMar>
+      </w:tblPr>
+      <w:tblGrid>
+        <w:gridCol w:w="9638"/>
+      </w:tblGrid>
+      <w:tr>
+        <w:trPr/>
+        <w:tc>
+          <w:tcPr>
+            <w:tcW w:w="9638" w:type="dxa"/>
+            <w:tcBorders>
+              <w:top w:val="single" w:sz="4" w:space="0" w:color="000000"/>
+              <w:left w:val="single" w:sz="4" w:space="0" w:color="000000"/>
+              <w:bottom w:val="single" w:sz="4" w:space="0" w:color="000000"/>
+              <w:right w:val="single" w:sz="4" w:space="0" w:color="000000"/>
+            </w:tcBorders>
+          </w:tcPr>
+          <w:p>
+            <w:pPr>
+              <w:pStyle w:val="TableContents"/>
+              <w:rPr>
+                <w:b w:val="false"/>
+                <w:b w:val="false"/>
+                <w:bCs w:val="false"/>
+              </w:rPr>
+            </w:pPr>
+            <w:r>
+              <w:rPr>
+                <w:b w:val="false"/>
+                <w:bCs w:val="false"/>
+              </w:rPr>
+              <w:drawing>
+                <wp:anchor behindDoc="0" distT="0" distB="0" distL="0" distR="0" simplePos="0" locked="0" layoutInCell="0" allowOverlap="1" relativeHeight="9">
+                  <wp:simplePos x="0" y="0"/>
+                  <wp:positionH relativeFrom="column">
+                    <wp:align>center</wp:align>
+                  </wp:positionH>
+                  <wp:positionV relativeFrom="paragraph">
+                    <wp:posOffset>635</wp:posOffset>
+                  </wp:positionV>
+                  <wp:extent cx="6050280" cy="3321050"/>
+                  <wp:effectExtent l="0" t="0" r="0" b="0"/>
+                  <wp:wrapSquare wrapText="largest"/>
+                  <wp:docPr id="8" name="Image8" descr=""/>
+                  <wp:cNvGraphicFramePr>
+                    <a:graphicFrameLocks xmlns:a="http://schemas.openxmlformats.org/drawingml/2006/main" noChangeAspect="1"/>
+                  </wp:cNvGraphicFramePr>
+                  <a:graphic xmlns:a="http://schemas.openxmlformats.org/drawingml/2006/main">
+                    <a:graphicData uri="http://schemas.openxmlformats.org/drawingml/2006/picture">
+                      <pic:pic xmlns:pic="http://schemas.openxmlformats.org/drawingml/2006/picture">
+                        <pic:nvPicPr>
+                          <pic:cNvPr id="8" name="Image8" descr=""/>
+                          <pic:cNvPicPr>
+                            <a:picLocks noChangeAspect="1" noChangeArrowheads="1"/>
+                          </pic:cNvPicPr>
+                        </pic:nvPicPr>
+                        <pic:blipFill>
+                          <a:blip r:embed="rId9"/>
+                          <a:stretch>
+                            <a:fillRect/>
+                          </a:stretch>
+                        </pic:blipFill>
+                        <pic:spPr bwMode="auto">
+                          <a:xfrm>
+                            <a:off x="0" y="0"/>
+                            <a:ext cx="6050280" cy="3321050"/>
+                          </a:xfrm>
+                          <a:prstGeom prst="rect">
+                            <a:avLst/>
+                          </a:prstGeom>
+                        </pic:spPr>
+                      </pic:pic>
+                    </a:graphicData>
+                  </a:graphic>
+                </wp:anchor>
+              </w:drawing>
+            </w:r>
+          </w:p>
+        </w:tc>
+      </w:tr>
+    </w:tbl>
+    <w:p>
+      <w:pPr>
+        <w:pStyle w:val="Normal"/>
+        <w:bidi w:val="0"/>
+        <w:jc w:val="left"/>
+        <w:rPr/>
+      </w:pPr>
+      <w:r>
+        <w:rPr/>
+        <w:t xml:space="preserve">Add new product for test </w:t>
+      </w:r>
+    </w:p>
+    <w:p>
+      <w:pPr>
+        <w:pStyle w:val="Normal"/>
+        <w:bidi w:val="0"/>
+        <w:jc w:val="left"/>
+        <w:rPr/>
+      </w:pPr>
+      <w:r>
+        <w:rPr/>
+      </w:r>
+    </w:p>
     <w:p>
       <w:pPr>
         <w:pStyle w:val="Normal"/>

</xml_diff>